<commit_message>
add: enlace al repositorio y referencia al video en ambos informes
</commit_message>
<xml_diff>
--- a/Informe Final/Informe_IEEE_v2.docx
+++ b/Informe Final/Informe_IEEE_v2.docx
@@ -2058,6 +2058,33 @@
       </w:pPr>
       <w:r>
         <w:t xml:space="preserve">[Kaggle] R. Park, “Fruit Quality Classification,” Kaggle Dataset. [En línea]. Disponible en: https://www.kaggle.com/datasets/ryandpark/fruit-quality-classification. [Accedido: 2026].</w:t>
+      </w:r>
+    </w:p>
+    <w:p>
+      <w:pPr>
+        <w:pStyle w:val="BodyText"/>
+      </w:pPr>
+      <w:r>
+        <w:t xml:space="preserve">[Repo] H. Rincón, R. Marquínez, S. Reyes y J. Ocampo, “Clasificación Automática de Calidad de Frutas por Visión por Computadora,” Repositorio GitHub. [En línea]. Disponible en: </w:t>
+      </w:r>
+      <w:hyperlink r:id="rId17">
+        <w:r>
+          <w:rPr>
+            <w:rStyle w:val="Hyperlink"/>
+          </w:rPr>
+          <w:t>https://github.com/Heiner1905/APOIII_FINAL</w:t>
+        </w:r>
+      </w:hyperlink>
+      <w:r>
+        <w:t xml:space="preserve">. [Accedido: 2026].</w:t>
+      </w:r>
+    </w:p>
+    <w:p>
+      <w:pPr>
+        <w:pStyle w:val="BodyText"/>
+      </w:pPr>
+      <w:r>
+        <w:t xml:space="preserve">[Video] H. Rincón, R. Marquínez, S. Reyes y J. Ocampo, “Video demostración del proyecto — Clasificación de calidad de frutas,” 2026. [En línea]. Disponible en: [enlace pendiente de publicación].</w:t>
       </w:r>
     </w:p>
     <w:bookmarkEnd w:id="17"/>

</xml_diff>

<commit_message>
add: diagrama de flujo CRISP-DM personalizado en la sección de Metodología
</commit_message>
<xml_diff>
--- a/Informe Final/Informe_IEEE_v2.docx
+++ b/Informe Final/Informe_IEEE_v2.docx
@@ -462,7 +462,59 @@
         <w:pStyle w:val="FirstParagraph"/>
       </w:pPr>
       <w:r>
-        <w:t xml:space="preserve">Se siguieron las seis fases de CRISP-DM [Wirth2000], adaptadas al problema.</w:t>
+        <w:t xml:space="preserve">Se siguieron las seis fases de CRISP-DM [Wirth2000], adaptadas al problema. La Fig. 1 muestra el diagrama de flujo personalizado.</w:t>
+      </w:r>
+    </w:p>
+    <w:p>
+      <w:pPr>
+        <w:pStyle w:val="BodyText"/>
+        <w:jc w:val="center"/>
+      </w:pPr>
+      <w:r>
+        <w:drawing>
+          <wp:inline xmlns:wp="http://schemas.openxmlformats.org/drawingml/2006/wordprocessingDrawing">
+            <wp:extent cx="3150000" cy="3150000"/>
+            <wp:docPr id="6" name="Fig1" descr="Diagrama CRISP-DM"/>
+            <a:graphic xmlns:a="http://schemas.openxmlformats.org/drawingml/2006/main">
+              <a:graphicData uri="http://schemas.openxmlformats.org/drawingml/2006/picture">
+                <pic:pic xmlns:pic="http://schemas.openxmlformats.org/drawingml/2006/picture">
+                  <pic:nvPicPr>
+                    <pic:cNvPr id="6" name="Fig1"/>
+                    <pic:cNvPicPr/>
+                  </pic:nvPicPr>
+                  <pic:blipFill>
+                    <a:blip r:embed="rId18"/>
+                    <a:stretch>
+                      <a:fillRect/>
+                    </a:stretch>
+                  </pic:blipFill>
+                  <pic:spPr>
+                    <a:xfrm>
+                      <a:off x="0" y="0"/>
+                      <a:ext cx="3150000" cy="3150000"/>
+                    </a:xfrm>
+                    <a:prstGeom prst="rect">
+                      <a:avLst/>
+                    </a:prstGeom>
+                  </pic:spPr>
+                </pic:pic>
+              </a:graphicData>
+            </a:graphic>
+          </wp:inline>
+        </w:drawing>
+      </w:r>
+    </w:p>
+    <w:p>
+      <w:pPr>
+        <w:pStyle w:val="BodyText"/>
+        <w:jc w:val="center"/>
+      </w:pPr>
+      <w:r>
+        <w:rPr>
+          <w:i/>
+          <w:iCs/>
+        </w:rPr>
+        <w:t>Fig. 1. Diagrama CRISP-DM adaptado al proyecto de clasificación de calidad de frutas.</w:t>
       </w:r>
     </w:p>
     <w:p>

</xml_diff>